<commit_message>
Docs: expand delivery rules into operational playbook (access mechanics, tooling, procedures) + regenerate Word (AZ/EN)
</commit_message>
<xml_diff>
--- a/senedler/word/az/AIVanta Is Qaydalari - AI Solutions (AZ).docx
+++ b/senedler/word/az/AIVanta Is Qaydalari - AI Solutions (AZ).docx
@@ -56,7 +56,7 @@
           <w:color w:val="14181F"/>
           <w:sz w:val="38"/>
         </w:rPr>
-        <w:t>AI Solutions — iş qaydaları</w:t>
+        <w:t>AI Solutions — İş Qaydaları</w:t>
       </w:r>
     </w:p>
     <w:p>
@@ -66,7 +66,7 @@
           <w:color w:val="22262E"/>
           <w:sz w:val="21"/>
         </w:rPr>
-        <w:t>Ümumi qaydalar burada da keçərlidir. Aşağıdakılar AI layihələrinə xas əlavələrdir.</w:t>
+        <w:t>Ümumi qaydalar tam keçərlidir. Aşağıdakılar AI layihələrinə xas əməli qaydalar, tool stack və prosedurlardır.</w:t>
       </w:r>
     </w:p>
     <w:p>
@@ -84,7 +84,609 @@
           <w:color w:val="0B7A67"/>
           <w:sz w:val="26"/>
         </w:rPr>
-        <w:t>Müştəridən nə istəyirik</w:t>
+        <w:t>1. Tool stack (standart)</w:t>
+      </w:r>
+    </w:p>
+    <w:tbl>
+      <w:tblPr>
+        <w:tblW w:type="auto" w:w="0"/>
+        <w:jc w:val="center"/>
+        <w:tblLayout w:type="autofit"/>
+        <w:tblLook w:firstColumn="1" w:firstRow="1" w:lastColumn="0" w:lastRow="0" w:noHBand="0" w:noVBand="1" w:val="04A0"/>
+        <w:tblBorders>
+          <w:top w:val="single" w:sz="6" w:space="0" w:color="D7DBE0"/>
+          <w:left w:val="single" w:sz="6" w:space="0" w:color="D7DBE0"/>
+          <w:bottom w:val="single" w:sz="6" w:space="0" w:color="D7DBE0"/>
+          <w:right w:val="single" w:sz="6" w:space="0" w:color="D7DBE0"/>
+          <w:insideH w:val="single" w:sz="6" w:space="0" w:color="D7DBE0"/>
+          <w:insideV w:val="single" w:sz="6" w:space="0" w:color="D7DBE0"/>
+        </w:tblBorders>
+      </w:tblPr>
+      <w:tblGrid>
+        <w:gridCol w:w="3249"/>
+        <w:gridCol w:w="3249"/>
+        <w:gridCol w:w="3249"/>
+      </w:tblGrid>
+      <w:tr>
+        <w:tc>
+          <w:tcPr>
+            <w:tcW w:type="dxa" w:w="3249"/>
+            <w:shd w:val="clear" w:fill="0B7A67"/>
+          </w:tcPr>
+          <w:p>
+            <w:r>
+              <w:rPr>
+                <w:rFonts w:ascii="Segoe UI" w:hAnsi="Segoe UI"/>
+                <w:b/>
+                <w:color w:val="FFFFFF"/>
+                <w:sz w:val="19"/>
+              </w:rPr>
+              <w:t>Məqsəd</w:t>
+            </w:r>
+          </w:p>
+        </w:tc>
+        <w:tc>
+          <w:tcPr>
+            <w:tcW w:type="dxa" w:w="3249"/>
+            <w:shd w:val="clear" w:fill="0B7A67"/>
+          </w:tcPr>
+          <w:p>
+            <w:r>
+              <w:rPr>
+                <w:rFonts w:ascii="Segoe UI" w:hAnsi="Segoe UI"/>
+                <w:b/>
+                <w:color w:val="FFFFFF"/>
+                <w:sz w:val="19"/>
+              </w:rPr>
+              <w:t>Tool</w:t>
+            </w:r>
+          </w:p>
+        </w:tc>
+        <w:tc>
+          <w:tcPr>
+            <w:tcW w:type="dxa" w:w="3249"/>
+            <w:shd w:val="clear" w:fill="0B7A67"/>
+          </w:tcPr>
+          <w:p>
+            <w:r>
+              <w:rPr>
+                <w:rFonts w:ascii="Segoe UI" w:hAnsi="Segoe UI"/>
+                <w:b/>
+                <w:color w:val="FFFFFF"/>
+                <w:sz w:val="19"/>
+              </w:rPr>
+              <w:t>Qeyd</w:t>
+            </w:r>
+          </w:p>
+        </w:tc>
+      </w:tr>
+      <w:tr>
+        <w:tc>
+          <w:tcPr>
+            <w:tcW w:type="dxa" w:w="3249"/>
+          </w:tcPr>
+          <w:p>
+            <w:pPr>
+              <w:spacing w:after="40"/>
+            </w:pPr>
+            <w:r>
+              <w:rPr>
+                <w:rFonts w:ascii="Segoe UI" w:hAnsi="Segoe UI"/>
+                <w:color w:val="22262E"/>
+                <w:sz w:val="19"/>
+              </w:rPr>
+              <w:t>Dil / mühit</w:t>
+            </w:r>
+          </w:p>
+        </w:tc>
+        <w:tc>
+          <w:tcPr>
+            <w:tcW w:type="dxa" w:w="3249"/>
+          </w:tcPr>
+          <w:p>
+            <w:pPr>
+              <w:spacing w:after="40"/>
+            </w:pPr>
+            <w:r>
+              <w:rPr>
+                <w:rFonts w:ascii="Segoe UI" w:hAnsi="Segoe UI"/>
+                <w:color w:val="22262E"/>
+                <w:sz w:val="19"/>
+              </w:rPr>
+              <w:t xml:space="preserve">Python 3.11+, </w:t>
+            </w:r>
+            <w:r>
+              <w:rPr>
+                <w:rFonts w:ascii="Consolas" w:hAnsi="Consolas"/>
+                <w:color w:val="14181F"/>
+                <w:sz w:val="19"/>
+              </w:rPr>
+              <w:t>venv</w:t>
+            </w:r>
+            <w:r>
+              <w:rPr>
+                <w:rFonts w:ascii="Segoe UI" w:hAnsi="Segoe UI"/>
+                <w:color w:val="22262E"/>
+                <w:sz w:val="19"/>
+              </w:rPr>
+              <w:t>/</w:t>
+            </w:r>
+            <w:r>
+              <w:rPr>
+                <w:rFonts w:ascii="Consolas" w:hAnsi="Consolas"/>
+                <w:color w:val="14181F"/>
+                <w:sz w:val="19"/>
+              </w:rPr>
+              <w:t>conda</w:t>
+            </w:r>
+          </w:p>
+        </w:tc>
+        <w:tc>
+          <w:tcPr>
+            <w:tcW w:type="dxa" w:w="3249"/>
+          </w:tcPr>
+          <w:p>
+            <w:pPr>
+              <w:spacing w:after="40"/>
+            </w:pPr>
+            <w:r>
+              <w:rPr>
+                <w:rFonts w:ascii="Segoe UI" w:hAnsi="Segoe UI"/>
+                <w:color w:val="22262E"/>
+                <w:sz w:val="19"/>
+              </w:rPr>
+              <w:t>Reproduksiya üçün versiyalar sabit</w:t>
+            </w:r>
+          </w:p>
+        </w:tc>
+      </w:tr>
+      <w:tr>
+        <w:tc>
+          <w:tcPr>
+            <w:tcW w:type="dxa" w:w="3249"/>
+            <w:shd w:val="clear" w:fill="F4F6F8"/>
+          </w:tcPr>
+          <w:p>
+            <w:pPr>
+              <w:spacing w:after="40"/>
+            </w:pPr>
+            <w:r>
+              <w:rPr>
+                <w:rFonts w:ascii="Segoe UI" w:hAnsi="Segoe UI"/>
+                <w:color w:val="22262E"/>
+                <w:sz w:val="19"/>
+              </w:rPr>
+              <w:t>Model</w:t>
+            </w:r>
+          </w:p>
+        </w:tc>
+        <w:tc>
+          <w:tcPr>
+            <w:tcW w:type="dxa" w:w="3249"/>
+            <w:shd w:val="clear" w:fill="F4F6F8"/>
+          </w:tcPr>
+          <w:p>
+            <w:pPr>
+              <w:spacing w:after="40"/>
+            </w:pPr>
+            <w:r>
+              <w:rPr>
+                <w:rFonts w:ascii="Segoe UI" w:hAnsi="Segoe UI"/>
+                <w:color w:val="22262E"/>
+                <w:sz w:val="19"/>
+              </w:rPr>
+              <w:t>PyTorch / TensorFlow, Hugging Face</w:t>
+            </w:r>
+          </w:p>
+        </w:tc>
+        <w:tc>
+          <w:tcPr>
+            <w:tcW w:type="dxa" w:w="3249"/>
+            <w:shd w:val="clear" w:fill="F4F6F8"/>
+          </w:tcPr>
+          <w:p>
+            <w:pPr>
+              <w:spacing w:after="40"/>
+            </w:pPr>
+            <w:r>
+              <w:rPr>
+                <w:rFonts w:ascii="Segoe UI" w:hAnsi="Segoe UI"/>
+                <w:color w:val="22262E"/>
+                <w:sz w:val="19"/>
+              </w:rPr>
+              <w:t>Tapşırığa görə seçilir</w:t>
+            </w:r>
+          </w:p>
+        </w:tc>
+      </w:tr>
+      <w:tr>
+        <w:tc>
+          <w:tcPr>
+            <w:tcW w:type="dxa" w:w="3249"/>
+          </w:tcPr>
+          <w:p>
+            <w:pPr>
+              <w:spacing w:after="40"/>
+            </w:pPr>
+            <w:r>
+              <w:rPr>
+                <w:rFonts w:ascii="Segoe UI" w:hAnsi="Segoe UI"/>
+                <w:color w:val="22262E"/>
+                <w:sz w:val="19"/>
+              </w:rPr>
+              <w:t>Eksperiment izləmə</w:t>
+            </w:r>
+          </w:p>
+        </w:tc>
+        <w:tc>
+          <w:tcPr>
+            <w:tcW w:type="dxa" w:w="3249"/>
+          </w:tcPr>
+          <w:p>
+            <w:pPr>
+              <w:spacing w:after="40"/>
+            </w:pPr>
+            <w:r>
+              <w:rPr>
+                <w:rFonts w:ascii="Segoe UI" w:hAnsi="Segoe UI"/>
+                <w:b/>
+                <w:color w:val="14181F"/>
+                <w:sz w:val="19"/>
+              </w:rPr>
+              <w:t>MLflow</w:t>
+            </w:r>
+          </w:p>
+        </w:tc>
+        <w:tc>
+          <w:tcPr>
+            <w:tcW w:type="dxa" w:w="3249"/>
+          </w:tcPr>
+          <w:p>
+            <w:pPr>
+              <w:spacing w:after="40"/>
+            </w:pPr>
+            <w:r>
+              <w:rPr>
+                <w:rFonts w:ascii="Segoe UI" w:hAnsi="Segoe UI"/>
+                <w:color w:val="22262E"/>
+                <w:sz w:val="19"/>
+              </w:rPr>
+              <w:t>Hər training run loglanır (parametr, metrik)</w:t>
+            </w:r>
+          </w:p>
+        </w:tc>
+      </w:tr>
+      <w:tr>
+        <w:tc>
+          <w:tcPr>
+            <w:tcW w:type="dxa" w:w="3249"/>
+            <w:shd w:val="clear" w:fill="F4F6F8"/>
+          </w:tcPr>
+          <w:p>
+            <w:pPr>
+              <w:spacing w:after="40"/>
+            </w:pPr>
+            <w:r>
+              <w:rPr>
+                <w:rFonts w:ascii="Segoe UI" w:hAnsi="Segoe UI"/>
+                <w:color w:val="22262E"/>
+                <w:sz w:val="19"/>
+              </w:rPr>
+              <w:t>Data versiyalama</w:t>
+            </w:r>
+          </w:p>
+        </w:tc>
+        <w:tc>
+          <w:tcPr>
+            <w:tcW w:type="dxa" w:w="3249"/>
+            <w:shd w:val="clear" w:fill="F4F6F8"/>
+          </w:tcPr>
+          <w:p>
+            <w:pPr>
+              <w:spacing w:after="40"/>
+            </w:pPr>
+            <w:r>
+              <w:rPr>
+                <w:rFonts w:ascii="Segoe UI" w:hAnsi="Segoe UI"/>
+                <w:b/>
+                <w:color w:val="14181F"/>
+                <w:sz w:val="19"/>
+              </w:rPr>
+              <w:t>DVC</w:t>
+            </w:r>
+          </w:p>
+        </w:tc>
+        <w:tc>
+          <w:tcPr>
+            <w:tcW w:type="dxa" w:w="3249"/>
+            <w:shd w:val="clear" w:fill="F4F6F8"/>
+          </w:tcPr>
+          <w:p>
+            <w:pPr>
+              <w:spacing w:after="40"/>
+            </w:pPr>
+            <w:r>
+              <w:rPr>
+                <w:rFonts w:ascii="Segoe UI" w:hAnsi="Segoe UI"/>
+                <w:color w:val="22262E"/>
+                <w:sz w:val="19"/>
+              </w:rPr>
+              <w:t>Data + model versiyası Git-ə bağlı</w:t>
+            </w:r>
+          </w:p>
+        </w:tc>
+      </w:tr>
+      <w:tr>
+        <w:tc>
+          <w:tcPr>
+            <w:tcW w:type="dxa" w:w="3249"/>
+          </w:tcPr>
+          <w:p>
+            <w:pPr>
+              <w:spacing w:after="40"/>
+            </w:pPr>
+            <w:r>
+              <w:rPr>
+                <w:rFonts w:ascii="Segoe UI" w:hAnsi="Segoe UI"/>
+                <w:color w:val="22262E"/>
+                <w:sz w:val="19"/>
+              </w:rPr>
+              <w:t>Konteyner</w:t>
+            </w:r>
+          </w:p>
+        </w:tc>
+        <w:tc>
+          <w:tcPr>
+            <w:tcW w:type="dxa" w:w="3249"/>
+          </w:tcPr>
+          <w:p>
+            <w:pPr>
+              <w:spacing w:after="40"/>
+            </w:pPr>
+            <w:r>
+              <w:rPr>
+                <w:rFonts w:ascii="Segoe UI" w:hAnsi="Segoe UI"/>
+                <w:b/>
+                <w:color w:val="14181F"/>
+                <w:sz w:val="19"/>
+              </w:rPr>
+              <w:t>Docker</w:t>
+            </w:r>
+            <w:r>
+              <w:rPr>
+                <w:rFonts w:ascii="Segoe UI" w:hAnsi="Segoe UI"/>
+                <w:color w:val="22262E"/>
+                <w:sz w:val="19"/>
+              </w:rPr>
+              <w:t xml:space="preserve"> (+ CUDA image)</w:t>
+            </w:r>
+          </w:p>
+        </w:tc>
+        <w:tc>
+          <w:tcPr>
+            <w:tcW w:type="dxa" w:w="3249"/>
+          </w:tcPr>
+          <w:p>
+            <w:pPr>
+              <w:spacing w:after="40"/>
+            </w:pPr>
+            <w:r>
+              <w:rPr>
+                <w:rFonts w:ascii="Segoe UI" w:hAnsi="Segoe UI"/>
+                <w:color w:val="22262E"/>
+                <w:sz w:val="19"/>
+              </w:rPr>
+              <w:t>Mühit fərqini aradan qaldırır</w:t>
+            </w:r>
+          </w:p>
+        </w:tc>
+      </w:tr>
+      <w:tr>
+        <w:tc>
+          <w:tcPr>
+            <w:tcW w:type="dxa" w:w="3249"/>
+            <w:shd w:val="clear" w:fill="F4F6F8"/>
+          </w:tcPr>
+          <w:p>
+            <w:pPr>
+              <w:spacing w:after="40"/>
+            </w:pPr>
+            <w:r>
+              <w:rPr>
+                <w:rFonts w:ascii="Segoe UI" w:hAnsi="Segoe UI"/>
+                <w:color w:val="22262E"/>
+                <w:sz w:val="19"/>
+              </w:rPr>
+              <w:t>Serving</w:t>
+            </w:r>
+          </w:p>
+        </w:tc>
+        <w:tc>
+          <w:tcPr>
+            <w:tcW w:type="dxa" w:w="3249"/>
+            <w:shd w:val="clear" w:fill="F4F6F8"/>
+          </w:tcPr>
+          <w:p>
+            <w:pPr>
+              <w:spacing w:after="40"/>
+            </w:pPr>
+            <w:r>
+              <w:rPr>
+                <w:rFonts w:ascii="Segoe UI" w:hAnsi="Segoe UI"/>
+                <w:b/>
+                <w:color w:val="14181F"/>
+                <w:sz w:val="19"/>
+              </w:rPr>
+              <w:t>FastAPI</w:t>
+            </w:r>
+            <w:r>
+              <w:rPr>
+                <w:rFonts w:ascii="Segoe UI" w:hAnsi="Segoe UI"/>
+                <w:color w:val="22262E"/>
+                <w:sz w:val="19"/>
+              </w:rPr>
+              <w:t xml:space="preserve"> (+ vLLM / Triton lazımdırsa)</w:t>
+            </w:r>
+          </w:p>
+        </w:tc>
+        <w:tc>
+          <w:tcPr>
+            <w:tcW w:type="dxa" w:w="3249"/>
+            <w:shd w:val="clear" w:fill="F4F6F8"/>
+          </w:tcPr>
+          <w:p>
+            <w:pPr>
+              <w:spacing w:after="40"/>
+            </w:pPr>
+            <w:r>
+              <w:rPr>
+                <w:rFonts w:ascii="Segoe UI" w:hAnsi="Segoe UI"/>
+                <w:color w:val="22262E"/>
+                <w:sz w:val="19"/>
+              </w:rPr>
+              <w:t>Model API kimi verilir</w:t>
+            </w:r>
+          </w:p>
+        </w:tc>
+      </w:tr>
+      <w:tr>
+        <w:tc>
+          <w:tcPr>
+            <w:tcW w:type="dxa" w:w="3249"/>
+          </w:tcPr>
+          <w:p>
+            <w:pPr>
+              <w:spacing w:after="40"/>
+            </w:pPr>
+            <w:r>
+              <w:rPr>
+                <w:rFonts w:ascii="Segoe UI" w:hAnsi="Segoe UI"/>
+                <w:color w:val="22262E"/>
+                <w:sz w:val="19"/>
+              </w:rPr>
+              <w:t>Drift monitorinq</w:t>
+            </w:r>
+          </w:p>
+        </w:tc>
+        <w:tc>
+          <w:tcPr>
+            <w:tcW w:type="dxa" w:w="3249"/>
+          </w:tcPr>
+          <w:p>
+            <w:pPr>
+              <w:spacing w:after="40"/>
+            </w:pPr>
+            <w:r>
+              <w:rPr>
+                <w:rFonts w:ascii="Segoe UI" w:hAnsi="Segoe UI"/>
+                <w:b/>
+                <w:color w:val="14181F"/>
+                <w:sz w:val="19"/>
+              </w:rPr>
+              <w:t>Evidently</w:t>
+            </w:r>
+          </w:p>
+        </w:tc>
+        <w:tc>
+          <w:tcPr>
+            <w:tcW w:type="dxa" w:w="3249"/>
+          </w:tcPr>
+          <w:p>
+            <w:pPr>
+              <w:spacing w:after="40"/>
+            </w:pPr>
+            <w:r>
+              <w:rPr>
+                <w:rFonts w:ascii="Segoe UI" w:hAnsi="Segoe UI"/>
+                <w:color w:val="22262E"/>
+                <w:sz w:val="19"/>
+              </w:rPr>
+              <w:t>Canlıda performans/drift izləmə</w:t>
+            </w:r>
+          </w:p>
+        </w:tc>
+      </w:tr>
+      <w:tr>
+        <w:tc>
+          <w:tcPr>
+            <w:tcW w:type="dxa" w:w="3249"/>
+            <w:shd w:val="clear" w:fill="F4F6F8"/>
+          </w:tcPr>
+          <w:p>
+            <w:pPr>
+              <w:spacing w:after="40"/>
+            </w:pPr>
+            <w:r>
+              <w:rPr>
+                <w:rFonts w:ascii="Segoe UI" w:hAnsi="Segoe UI"/>
+                <w:color w:val="22262E"/>
+                <w:sz w:val="19"/>
+              </w:rPr>
+              <w:t>GPU</w:t>
+            </w:r>
+          </w:p>
+        </w:tc>
+        <w:tc>
+          <w:tcPr>
+            <w:tcW w:type="dxa" w:w="3249"/>
+            <w:shd w:val="clear" w:fill="F4F6F8"/>
+          </w:tcPr>
+          <w:p>
+            <w:pPr>
+              <w:spacing w:after="40"/>
+            </w:pPr>
+            <w:r>
+              <w:rPr>
+                <w:rFonts w:ascii="Segoe UI" w:hAnsi="Segoe UI"/>
+                <w:color w:val="22262E"/>
+                <w:sz w:val="19"/>
+              </w:rPr>
+              <w:t>NVIDIA + CUDA</w:t>
+            </w:r>
+          </w:p>
+        </w:tc>
+        <w:tc>
+          <w:tcPr>
+            <w:tcW w:type="dxa" w:w="3249"/>
+            <w:shd w:val="clear" w:fill="F4F6F8"/>
+          </w:tcPr>
+          <w:p>
+            <w:pPr>
+              <w:spacing w:after="40"/>
+            </w:pPr>
+            <w:r>
+              <w:rPr>
+                <w:rFonts w:ascii="Segoe UI" w:hAnsi="Segoe UI"/>
+                <w:color w:val="22262E"/>
+                <w:sz w:val="19"/>
+              </w:rPr>
+              <w:t>Draytver/CUDA versiyası sənədləşir</w:t>
+            </w:r>
+          </w:p>
+        </w:tc>
+      </w:tr>
+    </w:tbl>
+    <w:p>
+      <w:pPr>
+        <w:spacing w:after="80"/>
+      </w:pPr>
+    </w:p>
+    <w:p>
+      <w:pPr>
+        <w:keepNext/>
+        <w:spacing w:before="280" w:after="100"/>
+        <w:pBdr>
+          <w:bottom w:val="single" w:sz="6" w:space="3" w:color="D7DBE0"/>
+        </w:pBdr>
+      </w:pPr>
+      <w:r>
+        <w:rPr>
+          <w:rFonts w:ascii="Segoe UI" w:hAnsi="Segoe UI"/>
+          <w:b/>
+          <w:color w:val="0B7A67"/>
+          <w:sz w:val="26"/>
+        </w:rPr>
+        <w:t>2. Müştəridən nə istəyirik</w:t>
       </w:r>
     </w:p>
     <w:p>
@@ -107,7 +709,7 @@
           <w:color w:val="22262E"/>
           <w:sz w:val="21"/>
         </w:rPr>
-        <w:t xml:space="preserve"> — ilk görüşdən sonra, qiymətləndirmə üçün (anonimləşdirilmiş ola bilər).</w:t>
+        <w:t xml:space="preserve"> — qiymətləndirmə üçün (anonimləşdirilmiş ola bilər).</w:t>
       </w:r>
     </w:p>
     <w:p>
@@ -130,7 +732,7 @@
           <w:color w:val="22262E"/>
           <w:sz w:val="21"/>
         </w:rPr>
-        <w:t xml:space="preserve"> — data ilə bağlı suallar POC üzərindən yox, birbaşa cavablandırılsın deyə.</w:t>
+        <w:t xml:space="preserve"> — sxem/məna sualları üçün.</w:t>
       </w:r>
     </w:p>
     <w:p>
@@ -153,7 +755,7 @@
           <w:color w:val="22262E"/>
           <w:sz w:val="21"/>
         </w:rPr>
-        <w:t xml:space="preserve"> — həftədə minimum 1–2 saat. Modelin düzgün öyrənməsi üçün sahəni bilən adamın rəyi vacibdir.</w:t>
+        <w:t xml:space="preserve"> — həftədə min. 1–2 saat.</w:t>
       </w:r>
     </w:p>
     <w:p>
@@ -176,7 +778,7 @@
           <w:color w:val="22262E"/>
           <w:sz w:val="21"/>
         </w:rPr>
-        <w:t xml:space="preserve"> on-prem işlənəcəksə GPU-lu VM (tələb layihəyə görə dəqiqləşir, tipik: NVIDIA 24 GB+ VRAM, 8 vCPU, 32 GB RAM, 200 GB SSD); cloud-dursa ayrıca project + GPU instance icazəsi. Xərc smetası əvvəlcədən verilir.</w:t>
+        <w:t xml:space="preserve"> on-prem işlənəcəksə GPU-lu VM (tipik: NVIDIA 24 GB+ VRAM, 8 vCPU, 32 GB RAM, 200 GB SSD); cloud-dursa ayrıca project + GPU instance kvotası. Smeta əvvəlcədən verilir.</w:t>
       </w:r>
     </w:p>
     <w:p>
@@ -194,7 +796,7 @@
           <w:color w:val="0B7A67"/>
           <w:sz w:val="26"/>
         </w:rPr>
-        <w:t>Data və model qaydaları</w:t>
+        <w:t>3. Data və model qaydaları</w:t>
       </w:r>
     </w:p>
     <w:p>
@@ -209,7 +811,7 @@
           <w:color w:val="14181F"/>
           <w:sz w:val="21"/>
         </w:rPr>
-        <w:t>Müştəri datası ilə paylaşılan (shared/global) model öyrətmirik.</w:t>
+        <w:t>Reproduksiya məcburidir:</w:t>
       </w:r>
       <w:r>
         <w:rPr>
@@ -217,7 +819,30 @@
           <w:color w:val="22262E"/>
           <w:sz w:val="21"/>
         </w:rPr>
-        <w:t xml:space="preserve"> Müştərinin datası yalnız onun öz həllində istifadə olunur.</w:t>
+        <w:t xml:space="preserve"> hansı model, hansı data (DVC hash), hansı parametrlə (MLflow run) — hamısı qeyddə. "Bu nəticəni necə aldıq" sualının cavabı həmişə olmalıdır.</w:t>
+      </w:r>
+    </w:p>
+    <w:p>
+      <w:pPr>
+        <w:pStyle w:val="ListBullet"/>
+        <w:spacing w:after="80"/>
+      </w:pPr>
+      <w:r>
+        <w:rPr>
+          <w:rFonts w:ascii="Segoe UI" w:hAnsi="Segoe UI"/>
+          <w:b/>
+          <w:color w:val="14181F"/>
+          <w:sz w:val="21"/>
+        </w:rPr>
+        <w:t>Data lineage</w:t>
+      </w:r>
+      <w:r>
+        <w:rPr>
+          <w:rFonts w:ascii="Segoe UI" w:hAnsi="Segoe UI"/>
+          <w:color w:val="22262E"/>
+          <w:sz w:val="21"/>
+        </w:rPr>
+        <w:t xml:space="preserve"> təhvil paketinə daxildir.</w:t>
       </w:r>
     </w:p>
     <w:p>
@@ -231,24 +856,7 @@
           <w:color w:val="22262E"/>
           <w:sz w:val="21"/>
         </w:rPr>
-        <w:t xml:space="preserve">3-cü tərəf API (OpenAI, Anthropic və s.) istifadə olunacaqsa: </w:t>
-      </w:r>
-      <w:r>
-        <w:rPr>
-          <w:rFonts w:ascii="Segoe UI" w:hAnsi="Segoe UI"/>
-          <w:b/>
-          <w:color w:val="14181F"/>
-          <w:sz w:val="21"/>
-        </w:rPr>
-        <w:t>əvvəlcədən yazılı razılıq</w:t>
-      </w:r>
-      <w:r>
-        <w:rPr>
-          <w:rFonts w:ascii="Segoe UI" w:hAnsi="Segoe UI"/>
-          <w:color w:val="22262E"/>
-          <w:sz w:val="21"/>
-        </w:rPr>
-        <w:t xml:space="preserve"> + hansı datanın API-yə gedəcəyi sənədləşir. Mümkün olan yerdə PII maskalanaraq göndərilir.</w:t>
+        <w:t>PII training datasından mümkün qədər çıxarılır / maskalanır.</w:t>
       </w:r>
     </w:p>
     <w:p>
@@ -262,21 +870,7 @@
           <w:color w:val="22262E"/>
           <w:sz w:val="21"/>
         </w:rPr>
-        <w:t>PII (şəxsi məlumat) training datasından mümkün qədər çıxarılır və ya maskalanır.</w:t>
-      </w:r>
-    </w:p>
-    <w:p>
-      <w:pPr>
-        <w:pStyle w:val="ListBullet"/>
-        <w:spacing w:after="80"/>
-      </w:pPr>
-      <w:r>
-        <w:rPr>
-          <w:rFonts w:ascii="Segoe UI" w:hAnsi="Segoe UI"/>
-          <w:color w:val="22262E"/>
-          <w:sz w:val="21"/>
-        </w:rPr>
-        <w:t>Data lineage saxlanılır: hansı model hansı data ilə, nə vaxt öyrədilib — təhvil sənədinə daxildir.</w:t>
+        <w:t>Test dataseti training-dən ayrı; qəbul yalnız test datası nəticəsi ilə.</w:t>
       </w:r>
     </w:p>
     <w:p>
@@ -294,7 +888,206 @@
           <w:color w:val="0B7A67"/>
           <w:sz w:val="26"/>
         </w:rPr>
-        <w:t>Keyfiyyət və qəbul</w:t>
+        <w:t>4. Üçüncü tərəf LLM (OpenAI / Anthropic / və s.) — data governance</w:t>
+      </w:r>
+    </w:p>
+    <w:p>
+      <w:r>
+        <w:rPr>
+          <w:rFonts w:ascii="Segoe UI" w:hAnsi="Segoe UI"/>
+          <w:color w:val="22262E"/>
+          <w:sz w:val="21"/>
+        </w:rPr>
+        <w:t>Bu, ən çox unudulan risk. Qayda:</w:t>
+      </w:r>
+    </w:p>
+    <w:p>
+      <w:pPr>
+        <w:pStyle w:val="ListBullet"/>
+        <w:spacing w:after="80"/>
+      </w:pPr>
+      <w:r>
+        <w:rPr>
+          <w:rFonts w:ascii="Segoe UI" w:hAnsi="Segoe UI"/>
+          <w:b/>
+          <w:color w:val="14181F"/>
+          <w:sz w:val="21"/>
+        </w:rPr>
+        <w:t>Standart: müştəri datası (xüsusən PII) 3-cü tərəf API-yə göndərilmir.</w:t>
+      </w:r>
+    </w:p>
+    <w:p>
+      <w:pPr>
+        <w:pStyle w:val="ListBullet"/>
+        <w:spacing w:after="80"/>
+      </w:pPr>
+      <w:r>
+        <w:rPr>
+          <w:rFonts w:ascii="Segoe UI" w:hAnsi="Segoe UI"/>
+          <w:color w:val="22262E"/>
+          <w:sz w:val="21"/>
+        </w:rPr>
+        <w:t xml:space="preserve">Göndəriləcəksə: (1) </w:t>
+      </w:r>
+      <w:r>
+        <w:rPr>
+          <w:rFonts w:ascii="Segoe UI" w:hAnsi="Segoe UI"/>
+          <w:b/>
+          <w:color w:val="14181F"/>
+          <w:sz w:val="21"/>
+        </w:rPr>
+        <w:t>əvvəlcədən yazılı razılıq</w:t>
+      </w:r>
+      <w:r>
+        <w:rPr>
+          <w:rFonts w:ascii="Segoe UI" w:hAnsi="Segoe UI"/>
+          <w:color w:val="22262E"/>
+          <w:sz w:val="21"/>
+        </w:rPr>
+        <w:t xml:space="preserve">, (2) hansı data, hansı provayderə — sənədləşir, (3) mümkün olan yerdə PII göndərişdən əvvəl </w:t>
+      </w:r>
+      <w:r>
+        <w:rPr>
+          <w:rFonts w:ascii="Segoe UI" w:hAnsi="Segoe UI"/>
+          <w:b/>
+          <w:color w:val="14181F"/>
+          <w:sz w:val="21"/>
+        </w:rPr>
+        <w:t>redaksiya/maskalama</w:t>
+      </w:r>
+      <w:r>
+        <w:rPr>
+          <w:rFonts w:ascii="Segoe UI" w:hAnsi="Segoe UI"/>
+          <w:color w:val="22262E"/>
+          <w:sz w:val="21"/>
+        </w:rPr>
+        <w:t>.</w:t>
+      </w:r>
+    </w:p>
+    <w:p>
+      <w:pPr>
+        <w:pStyle w:val="ListBullet"/>
+        <w:spacing w:after="80"/>
+      </w:pPr>
+      <w:r>
+        <w:rPr>
+          <w:rFonts w:ascii="Segoe UI" w:hAnsi="Segoe UI"/>
+          <w:color w:val="22262E"/>
+          <w:sz w:val="21"/>
+        </w:rPr>
+        <w:t xml:space="preserve">Provayderin </w:t>
+      </w:r>
+      <w:r>
+        <w:rPr>
+          <w:rFonts w:ascii="Segoe UI" w:hAnsi="Segoe UI"/>
+          <w:b/>
+          <w:color w:val="14181F"/>
+          <w:sz w:val="21"/>
+        </w:rPr>
+        <w:t>"zero-retention" / enterprise</w:t>
+      </w:r>
+      <w:r>
+        <w:rPr>
+          <w:rFonts w:ascii="Segoe UI" w:hAnsi="Segoe UI"/>
+          <w:color w:val="22262E"/>
+          <w:sz w:val="21"/>
+        </w:rPr>
+        <w:t xml:space="preserve"> rejimi seçilir (data training üçün saxlanmasın).</w:t>
+      </w:r>
+    </w:p>
+    <w:p>
+      <w:pPr>
+        <w:pStyle w:val="ListBullet"/>
+        <w:spacing w:after="80"/>
+      </w:pPr>
+      <w:r>
+        <w:rPr>
+          <w:rFonts w:ascii="Segoe UI" w:hAnsi="Segoe UI"/>
+          <w:b/>
+          <w:color w:val="14181F"/>
+          <w:sz w:val="21"/>
+        </w:rPr>
+        <w:t>Prompt injection</w:t>
+      </w:r>
+      <w:r>
+        <w:rPr>
+          <w:rFonts w:ascii="Segoe UI" w:hAnsi="Segoe UI"/>
+          <w:color w:val="22262E"/>
+          <w:sz w:val="21"/>
+        </w:rPr>
+        <w:t xml:space="preserve"> müdafiəsi: istifadəçi girişindən gələn mətn sistem təlimatı kimi qəbul edilmir.</w:t>
+      </w:r>
+    </w:p>
+    <w:p>
+      <w:pPr>
+        <w:pStyle w:val="ListBullet"/>
+        <w:spacing w:after="80"/>
+      </w:pPr>
+      <w:r>
+        <w:rPr>
+          <w:rFonts w:ascii="Segoe UI" w:hAnsi="Segoe UI"/>
+          <w:color w:val="22262E"/>
+          <w:sz w:val="21"/>
+        </w:rPr>
+        <w:t xml:space="preserve">Prompt/cavab logları </w:t>
+      </w:r>
+      <w:r>
+        <w:rPr>
+          <w:rFonts w:ascii="Segoe UI" w:hAnsi="Segoe UI"/>
+          <w:b/>
+          <w:color w:val="14181F"/>
+          <w:sz w:val="21"/>
+        </w:rPr>
+        <w:t>təhlükəsiz</w:t>
+      </w:r>
+      <w:r>
+        <w:rPr>
+          <w:rFonts w:ascii="Segoe UI" w:hAnsi="Segoe UI"/>
+          <w:color w:val="22262E"/>
+          <w:sz w:val="21"/>
+        </w:rPr>
+        <w:t xml:space="preserve"> saxlanılır (PII log-a düşməsin).</w:t>
+      </w:r>
+    </w:p>
+    <w:p>
+      <w:pPr>
+        <w:pStyle w:val="ListBullet"/>
+        <w:spacing w:after="80"/>
+      </w:pPr>
+      <w:r>
+        <w:rPr>
+          <w:rFonts w:ascii="Segoe UI" w:hAnsi="Segoe UI"/>
+          <w:b/>
+          <w:color w:val="14181F"/>
+          <w:sz w:val="21"/>
+        </w:rPr>
+        <w:t>Təsdiqli provayder + icazəli data sinfi matrisi</w:t>
+      </w:r>
+      <w:r>
+        <w:rPr>
+          <w:rFonts w:ascii="Segoe UI" w:hAnsi="Segoe UI"/>
+          <w:color w:val="22262E"/>
+          <w:sz w:val="21"/>
+        </w:rPr>
+        <w:t xml:space="preserve"> hər layihədə yazılır.</w:t>
+      </w:r>
+    </w:p>
+    <w:p>
+      <w:pPr>
+        <w:keepNext/>
+        <w:spacing w:before="280" w:after="100"/>
+        <w:pBdr>
+          <w:bottom w:val="single" w:sz="6" w:space="3" w:color="D7DBE0"/>
+        </w:pBdr>
+      </w:pPr>
+      <w:r>
+        <w:rPr>
+          <w:rFonts w:ascii="Segoe UI" w:hAnsi="Segoe UI"/>
+          <w:b/>
+          <w:color w:val="0B7A67"/>
+          <w:sz w:val="26"/>
+        </w:rPr>
+        <w:t>5. Keyfiyyət və qəbul</w:t>
       </w:r>
     </w:p>
     <w:p>
@@ -325,7 +1118,7 @@
           <w:color w:val="22262E"/>
           <w:sz w:val="21"/>
         </w:rPr>
-        <w:t xml:space="preserve"> yazılır: minimum dəqiqlik / precision-recall / cavab müddəti — layihəyə uyğun metrik.</w:t>
+        <w:t>: min. dəqiqlik / precision-recall / cavab müddəti.</w:t>
       </w:r>
     </w:p>
     <w:p>
@@ -339,21 +1132,7 @@
           <w:color w:val="22262E"/>
           <w:sz w:val="21"/>
         </w:rPr>
-        <w:t>Metrik POC mərhələsində ölçülür və hədəf realdırsa təsdiqlənir; deyilsə, hədəf birlikdə yenidən baxılır — sonda sürpriz olmur.</w:t>
-      </w:r>
-    </w:p>
-    <w:p>
-      <w:pPr>
-        <w:pStyle w:val="ListBullet"/>
-        <w:spacing w:after="80"/>
-      </w:pPr>
-      <w:r>
-        <w:rPr>
-          <w:rFonts w:ascii="Segoe UI" w:hAnsi="Segoe UI"/>
-          <w:color w:val="22262E"/>
-          <w:sz w:val="21"/>
-        </w:rPr>
-        <w:t>Test dataseti training-dən ayrı saxlanılır; qəbul yalnız test datası üzərindəki nəticə ilə olur.</w:t>
+        <w:t>Metrik POC-da ölçülür; hədəf realdırsa təsdiqlənir, deyilsə birlikdə yenidən baxılır — sonda sürpriz olmur.</w:t>
       </w:r>
     </w:p>
     <w:p>
@@ -371,7 +1150,7 @@
           <w:color w:val="0B7A67"/>
           <w:sz w:val="26"/>
         </w:rPr>
-        <w:t>Production qaydaları</w:t>
+        <w:t>6. Production qaydaları</w:t>
       </w:r>
     </w:p>
     <w:p>
@@ -394,7 +1173,7 @@
           <w:color w:val="14181F"/>
           <w:sz w:val="21"/>
         </w:rPr>
-        <w:t>monitorinq qurulur:</w:t>
+        <w:t>monitorinq:</w:t>
       </w:r>
       <w:r>
         <w:rPr>
@@ -402,7 +1181,7 @@
           <w:color w:val="22262E"/>
           <w:sz w:val="21"/>
         </w:rPr>
-        <w:t xml:space="preserve"> performans, cavab müddəti, data drift. Alertlər kimə gedəcəyi runbook-da yazılır.</w:t>
+        <w:t xml:space="preserve"> performans, cavab müddəti, data drift (Evidently). Alert kimə gedir — runbook-da.</w:t>
       </w:r>
     </w:p>
     <w:p>
@@ -416,7 +1195,24 @@
           <w:color w:val="22262E"/>
           <w:sz w:val="21"/>
         </w:rPr>
-        <w:t>Modelin cavablarına insan nəzarəti lazımdırsa (yüksək riskli qərarlar), human-in-the-loop axını dizaynda əvvəlcədən nəzərə alınır.</w:t>
+        <w:t xml:space="preserve">Yüksək riskli qərarlarda </w:t>
+      </w:r>
+      <w:r>
+        <w:rPr>
+          <w:rFonts w:ascii="Segoe UI" w:hAnsi="Segoe UI"/>
+          <w:b/>
+          <w:color w:val="14181F"/>
+          <w:sz w:val="21"/>
+        </w:rPr>
+        <w:t>human-in-the-loop</w:t>
+      </w:r>
+      <w:r>
+        <w:rPr>
+          <w:rFonts w:ascii="Segoe UI" w:hAnsi="Segoe UI"/>
+          <w:color w:val="22262E"/>
+          <w:sz w:val="21"/>
+        </w:rPr>
+        <w:t xml:space="preserve"> dizaynda əvvəlcədən var.</w:t>
       </w:r>
     </w:p>
     <w:p>
@@ -430,7 +1226,47 @@
           <w:color w:val="22262E"/>
           <w:sz w:val="21"/>
         </w:rPr>
-        <w:t>Yeni model versiyası production-a yalnız köhnə ilə müqayisə testindən keçəndən sonra çıxır; köhnə versiyaya qayıtmaq (rollback) həmişə mümkün saxlanılır.</w:t>
+        <w:t xml:space="preserve">Yeni model versiyası prod-a yalnız köhnə ilə </w:t>
+      </w:r>
+      <w:r>
+        <w:rPr>
+          <w:rFonts w:ascii="Segoe UI" w:hAnsi="Segoe UI"/>
+          <w:b/>
+          <w:color w:val="14181F"/>
+          <w:sz w:val="21"/>
+        </w:rPr>
+        <w:t>müqayisə testindən</w:t>
+      </w:r>
+      <w:r>
+        <w:rPr>
+          <w:rFonts w:ascii="Segoe UI" w:hAnsi="Segoe UI"/>
+          <w:color w:val="22262E"/>
+          <w:sz w:val="21"/>
+        </w:rPr>
+        <w:t xml:space="preserve"> sonra; rollback həmişə mümkün.</w:t>
+      </w:r>
+    </w:p>
+    <w:p>
+      <w:pPr>
+        <w:pStyle w:val="ListBullet"/>
+        <w:spacing w:after="80"/>
+      </w:pPr>
+      <w:r>
+        <w:rPr>
+          <w:rFonts w:ascii="Segoe UI" w:hAnsi="Segoe UI"/>
+          <w:b/>
+          <w:color w:val="14181F"/>
+          <w:sz w:val="21"/>
+        </w:rPr>
+        <w:t>GPU instansları boş qalanda söndürülür</w:t>
+      </w:r>
+      <w:r>
+        <w:rPr>
+          <w:rFonts w:ascii="Segoe UI" w:hAnsi="Segoe UI"/>
+          <w:color w:val="22262E"/>
+          <w:sz w:val="21"/>
+        </w:rPr>
+        <w:t xml:space="preserve"> — xərc yeyir (unudulan nüans).</w:t>
       </w:r>
     </w:p>
     <w:p>
@@ -448,7 +1284,53 @@
           <w:color w:val="0B7A67"/>
           <w:sz w:val="26"/>
         </w:rPr>
-        <w:t>Təhvildə əlavə olaraq</w:t>
+        <w:t>7. Təhvildə əlavə olaraq</w:t>
+      </w:r>
+    </w:p>
+    <w:p>
+      <w:pPr>
+        <w:pStyle w:val="ListBullet"/>
+        <w:spacing w:after="80"/>
+      </w:pPr>
+      <w:r>
+        <w:rPr>
+          <w:rFonts w:ascii="Segoe UI" w:hAnsi="Segoe UI"/>
+          <w:b/>
+          <w:color w:val="14181F"/>
+          <w:sz w:val="21"/>
+        </w:rPr>
+        <w:t>Model kartı:</w:t>
+      </w:r>
+      <w:r>
+        <w:rPr>
+          <w:rFonts w:ascii="Segoe UI" w:hAnsi="Segoe UI"/>
+          <w:color w:val="22262E"/>
+          <w:sz w:val="21"/>
+        </w:rPr>
+        <w:t xml:space="preserve"> nə edir, hansı data ilə öyrədilib, limitləri nədir.</w:t>
+      </w:r>
+    </w:p>
+    <w:p>
+      <w:pPr>
+        <w:pStyle w:val="ListBullet"/>
+        <w:spacing w:after="80"/>
+      </w:pPr>
+      <w:r>
+        <w:rPr>
+          <w:rFonts w:ascii="Segoe UI" w:hAnsi="Segoe UI"/>
+          <w:b/>
+          <w:color w:val="14181F"/>
+          <w:sz w:val="21"/>
+        </w:rPr>
+        <w:t>Retraining təlimatı:</w:t>
+      </w:r>
+      <w:r>
+        <w:rPr>
+          <w:rFonts w:ascii="Segoe UI" w:hAnsi="Segoe UI"/>
+          <w:color w:val="22262E"/>
+          <w:sz w:val="21"/>
+        </w:rPr>
+        <w:t xml:space="preserve"> nə vaxt lazımdır, necə edilir.</w:t>
       </w:r>
     </w:p>
     <w:p>
@@ -462,7 +1344,7 @@
           <w:color w:val="22262E"/>
           <w:sz w:val="21"/>
         </w:rPr>
-        <w:t>Model kartı: nə edir, hansı data ilə öyrədilib, limitləri nədir.</w:t>
+        <w:t>Monitorinq dashboard-una giriş + alert qaydaları.</w:t>
       </w:r>
     </w:p>
     <w:p>
@@ -476,21 +1358,7 @@
           <w:color w:val="22262E"/>
           <w:sz w:val="21"/>
         </w:rPr>
-        <w:t>Yenidən öyrətmə (retraining) təlimatı: nə vaxt lazımdır, necə edilir.</w:t>
-      </w:r>
-    </w:p>
-    <w:p>
-      <w:pPr>
-        <w:pStyle w:val="ListBullet"/>
-        <w:spacing w:after="80"/>
-      </w:pPr>
-      <w:r>
-        <w:rPr>
-          <w:rFonts w:ascii="Segoe UI" w:hAnsi="Segoe UI"/>
-          <w:color w:val="22262E"/>
-          <w:sz w:val="21"/>
-        </w:rPr>
-        <w:t>Monitorinq dashboard-una giriş və alert qaydaları.</w:t>
+        <w:t>Təsdiqli LLM provayder + data sinfi matrisi.</w:t>
       </w:r>
     </w:p>
     <w:sectPr>

</xml_diff>